<commit_message>
fix: Taller actualizado a martes 7 abril 7PM (ya no Pascua 5 abril)
- content.json: fecha confirmada, PC-WORKSHOP-DATE resuelto
- 5 HTMLs: countdown apunta a 2026-04-07T19:00-05:00
- 4 MDs: todas las referencias "Pascua/Easter/5 abril" actualizadas
- 4 DOCX regenerados con fecha correcta
- Google Calendar link actualizado
- 13 archivos modificados

Co-Authored-By: Claude Opus 4.6 (1M context) <noreply@anthropic.com>
</commit_message>
<xml_diff>
--- a/propuesta-bootcamp-ejecutivo-quito-2026/outputs/v2/export/propuesta-detallada-en.docx
+++ b/propuesta-bootcamp-ejecutivo-quito-2026/outputs/v2/export/propuesta-detallada-en.docx
@@ -1481,7 +1481,7 @@
           <w:sz w:val="20"/>
           <w:szCs w:val="20"/>
         </w:rPr>
-        <w:t xml:space="preserve">Date: Easter Sunday, April 5, 2026</w:t>
+        <w:t xml:space="preserve">Date: Tuesday April 7, 7:00 PM, April 7, 2026</w:t>
       </w:r>
     </w:p>
     <w:p>
@@ -3399,7 +3399,7 @@
                 <w:sz w:val="18"/>
                 <w:szCs w:val="18"/>
               </w:rPr>
-              <w:t xml:space="preserve">April 5, 2026 (Easter)</w:t>
+              <w:t xml:space="preserve">April 7, 2026 (Tuesday April 7)</w:t>
             </w:r>
           </w:p>
         </w:tc>
@@ -7942,7 +7942,7 @@
           <w:sz w:val="20"/>
           <w:szCs w:val="20"/>
         </w:rPr>
-        <w:t xml:space="preserve">1. Reserve your seat at the free Workshop (April 5): contacto@metodologia.info</w:t>
+        <w:t xml:space="preserve">1. Reserve your seat at the free Workshop (April 7): contacto@metodologia.info</w:t>
       </w:r>
     </w:p>
     <w:p>

</xml_diff>

<commit_message>
content: 13 asistentes especializados (no personalizados) + bibliotecas de prompts
Clarificacion importante del modelo de asistentes:
- Son ESPECIALIZADOS por funcion, no personalizados por individuo
- Disponibles desde el dia 1 para flujos de trabajo
- Durante el bootcamp se explica como usarlos mejor que el publico
- La personalizacion es de Pristino (agente personal), no de los 13

Nuevo deliverable: Bibliotecas de Prompts
- Biblioteca Universal de Prompts (cualquier profesional)
- Biblioteca de Prompts para Directivos y Managers (estrategia,
  decision, delegacion, comunicacion ejecutiva, reportes)

Actualizado en content.json, 4 MDs, 2 HTMLs, 4 DOCX.
Iconos toggle: luna izquierda, sol derecha (confirmado correcto).

Co-Authored-By: Claude Opus 4.6 (1M context) <noreply@anthropic.com>
</commit_message>
<xml_diff>
--- a/propuesta-bootcamp-ejecutivo-quito-2026/outputs/v2/export/propuesta-detallada-en.docx
+++ b/propuesta-bootcamp-ejecutivo-quito-2026/outputs/v2/export/propuesta-detallada-en.docx
@@ -530,7 +530,7 @@
           <w:sz w:val="22"/>
           <w:szCs w:val="22"/>
         </w:rPr>
-        <w:t xml:space="preserve">13 AI Assistants</w:t>
+        <w:t xml:space="preserve">13 Specialized AI Assistants</w:t>
       </w:r>
     </w:p>
     <w:p>
@@ -544,7 +544,7 @@
           <w:sz w:val="20"/>
           <w:szCs w:val="20"/>
         </w:rPr>
-        <w:t xml:space="preserve">  •  Specialized by executive function (communication, analysis, scheduling, decisions, reports...)</w:t>
+        <w:t xml:space="preserve">  •  Available from day 1 for use in workflows</w:t>
       </w:r>
     </w:p>
     <w:p>
@@ -558,7 +558,7 @@
           <w:sz w:val="20"/>
           <w:szCs w:val="20"/>
         </w:rPr>
-        <w:t xml:space="preserve">  •  Configured during the 9 co-creation sessions</w:t>
+        <w:t xml:space="preserve">  •  Specialized by function (communication, analysis, scheduling, decisions, reports...), not personalized by individual</w:t>
       </w:r>
     </w:p>
     <w:p>
@@ -572,7 +572,66 @@
           <w:sz w:val="20"/>
           <w:szCs w:val="20"/>
         </w:rPr>
+        <w:t xml:space="preserve">  •  During the bootcamp they are delivered and explained how to use them better than the general public</w:t>
+      </w:r>
+    </w:p>
+    <w:p>
+      <w:pPr>
+        <w:spacing w:after="60"/>
+      </w:pPr>
+      <w:r>
+        <w:rPr>
+          <w:rFonts w:ascii="Trebuchet MS" w:cs="Trebuchet MS" w:eastAsia="Trebuchet MS" w:hAnsi="Trebuchet MS"/>
+          <w:color w:val="1F2833"/>
+          <w:sz w:val="20"/>
+          <w:szCs w:val="20"/>
+        </w:rPr>
         <w:t xml:space="preserve">  •  Base set included in the bootcamp; additional assistants available at $347 USD each</w:t>
+      </w:r>
+    </w:p>
+    <w:p>
+      <w:pPr>
+        <w:pStyle w:val="Heading3"/>
+        <w:spacing w:after="100" w:before="200"/>
+      </w:pPr>
+      <w:r>
+        <w:rPr>
+          <w:rFonts w:ascii="Arial" w:cs="Arial" w:eastAsia="Arial" w:hAnsi="Arial"/>
+          <w:b/>
+          <w:bCs/>
+          <w:color w:val="FFA000"/>
+          <w:sz w:val="22"/>
+          <w:szCs w:val="22"/>
+        </w:rPr>
+        <w:t xml:space="preserve">Prompt Libraries</w:t>
+      </w:r>
+    </w:p>
+    <w:p>
+      <w:pPr>
+        <w:spacing w:after="60"/>
+      </w:pPr>
+      <w:r>
+        <w:rPr>
+          <w:rFonts w:ascii="Trebuchet MS" w:cs="Trebuchet MS" w:eastAsia="Trebuchet MS" w:hAnsi="Trebuchet MS"/>
+          <w:color w:val="1F2833"/>
+          <w:sz w:val="20"/>
+          <w:szCs w:val="20"/>
+        </w:rPr>
+        <w:t xml:space="preserve">  •  Universal Prompt Library: collection for any professional, access from day 1</w:t>
+      </w:r>
+    </w:p>
+    <w:p>
+      <w:pPr>
+        <w:spacing w:after="60"/>
+      </w:pPr>
+      <w:r>
+        <w:rPr>
+          <w:rFonts w:ascii="Trebuchet MS" w:cs="Trebuchet MS" w:eastAsia="Trebuchet MS" w:hAnsi="Trebuchet MS"/>
+          <w:color w:val="1F2833"/>
+          <w:sz w:val="20"/>
+          <w:szCs w:val="20"/>
+        </w:rPr>
+        <w:t xml:space="preserve">  •  Executive &amp; Manager Prompt Library: specialized prompts for strategy, decision-making, delegation, executive communication, reports</w:t>
       </w:r>
     </w:p>
     <w:p>

</xml_diff>

<commit_message>
content: deliverables autoexplicativos — sin necesidad de explicar nada
Cada entregable ahora tiene nombre concreto + descripcion que se
entiende sola:

1. 1 agente propio (Pristino, Open Source, obra de Javier Montano)
2. 13 asistentes IA especializados (flujos de trabajo dia 1)
3. 1 Playbook "Como Dirigir en la Era de la IA"
4. 2 bibliotecas de prompts (Universal + Ejecutiva)
5. 1 segundo cerebro digital (NotebookLM, memoria 24/7)
6. 9 sesiones de co-creacion (2h, construimos juntos)
7. 1 Campus Virtual (recursos, comunidad, 1 mes incluido)

Actualizado en content.json, 4 MDs, 4 DOCX.
Formato tabla en propuestas para maxima claridad.

Co-Authored-By: Claude Opus 4.6 (1M context) <noreply@anthropic.com>
</commit_message>
<xml_diff>
--- a/propuesta-bootcamp-ejecutivo-quito-2026/outputs/v2/export/propuesta-detallada-en.docx
+++ b/propuesta-bootcamp-ejecutivo-quito-2026/outputs/v2/export/propuesta-detallada-en.docx
@@ -440,7 +440,7 @@
           <w:sz w:val="20"/>
           <w:szCs w:val="20"/>
         </w:rPr>
-        <w:t xml:space="preserve">The CAO Bootcamp does not teach AI — it installs a custom agentic work system. By the end of the 20 hours, the executive operates with:</w:t>
+        <w:t xml:space="preserve">The CAO Bootcamp does not teach AI — it installs a custom agentic work system. By the end of the 20 hours, the executive takes home:</w:t>
       </w:r>
     </w:p>
     <w:p>
@@ -457,256 +457,559 @@
           <w:sz w:val="22"/>
           <w:szCs w:val="22"/>
         </w:rPr>
-        <w:t xml:space="preserve">Pristino — Your Personal Agent</w:t>
-      </w:r>
-    </w:p>
-    <w:p>
-      <w:pPr>
-        <w:spacing w:after="60"/>
-      </w:pPr>
-      <w:r>
-        <w:rPr>
-          <w:rFonts w:ascii="Trebuchet MS" w:cs="Trebuchet MS" w:eastAsia="Trebuchet MS" w:hAnsi="Trebuchet MS"/>
-          <w:color w:val="1F2833"/>
-          <w:sz w:val="20"/>
-          <w:szCs w:val="20"/>
-        </w:rPr>
-        <w:t xml:space="preserve">  •  AI agent configured with your real work context</w:t>
-      </w:r>
-    </w:p>
-    <w:p>
-      <w:pPr>
-        <w:spacing w:after="60"/>
-      </w:pPr>
-      <w:r>
-        <w:rPr>
-          <w:rFonts w:ascii="Trebuchet MS" w:cs="Trebuchet MS" w:eastAsia="Trebuchet MS" w:hAnsi="Trebuchet MS"/>
-          <w:color w:val="1F2833"/>
-          <w:sz w:val="20"/>
-          <w:szCs w:val="20"/>
-        </w:rPr>
-        <w:t xml:space="preserve">  •  Open Source, local, yours forever</w:t>
-      </w:r>
-    </w:p>
-    <w:p>
-      <w:pPr>
-        <w:spacing w:after="60"/>
-      </w:pPr>
-      <w:r>
-        <w:rPr>
-          <w:rFonts w:ascii="Trebuchet MS" w:cs="Trebuchet MS" w:eastAsia="Trebuchet MS" w:hAnsi="Trebuchet MS"/>
-          <w:color w:val="1F2833"/>
-          <w:sz w:val="20"/>
-          <w:szCs w:val="20"/>
-        </w:rPr>
-        <w:t xml:space="preserve">  •  Connected to your work ecosystem (Gmail, Calendar, Drive)</w:t>
-      </w:r>
-    </w:p>
-    <w:p>
-      <w:pPr>
-        <w:spacing w:after="60"/>
-      </w:pPr>
-      <w:r>
-        <w:rPr>
-          <w:rFonts w:ascii="Trebuchet MS" w:cs="Trebuchet MS" w:eastAsia="Trebuchet MS" w:hAnsi="Trebuchet MS"/>
-          <w:color w:val="1F2833"/>
-          <w:sz w:val="20"/>
-          <w:szCs w:val="20"/>
-        </w:rPr>
-        <w:t xml:space="preserve">  •  Auditable: the executive sees exactly what it does and why</w:t>
-      </w:r>
-    </w:p>
-    <w:p>
-      <w:pPr>
-        <w:pStyle w:val="Heading3"/>
-        <w:spacing w:after="100" w:before="200"/>
-      </w:pPr>
-      <w:r>
-        <w:rPr>
-          <w:rFonts w:ascii="Arial" w:cs="Arial" w:eastAsia="Arial" w:hAnsi="Arial"/>
-          <w:b/>
-          <w:bCs/>
-          <w:color w:val="FFA000"/>
-          <w:sz w:val="22"/>
-          <w:szCs w:val="22"/>
-        </w:rPr>
-        <w:t xml:space="preserve">13 Specialized AI Assistants</w:t>
-      </w:r>
-    </w:p>
-    <w:p>
-      <w:pPr>
-        <w:spacing w:after="60"/>
-      </w:pPr>
-      <w:r>
-        <w:rPr>
-          <w:rFonts w:ascii="Trebuchet MS" w:cs="Trebuchet MS" w:eastAsia="Trebuchet MS" w:hAnsi="Trebuchet MS"/>
-          <w:color w:val="1F2833"/>
-          <w:sz w:val="20"/>
-          <w:szCs w:val="20"/>
-        </w:rPr>
-        <w:t xml:space="preserve">  •  Available from day 1 for use in workflows</w:t>
-      </w:r>
-    </w:p>
-    <w:p>
-      <w:pPr>
-        <w:spacing w:after="60"/>
-      </w:pPr>
-      <w:r>
-        <w:rPr>
-          <w:rFonts w:ascii="Trebuchet MS" w:cs="Trebuchet MS" w:eastAsia="Trebuchet MS" w:hAnsi="Trebuchet MS"/>
-          <w:color w:val="1F2833"/>
-          <w:sz w:val="20"/>
-          <w:szCs w:val="20"/>
-        </w:rPr>
-        <w:t xml:space="preserve">  •  Specialized by function (communication, analysis, scheduling, decisions, reports...), not personalized by individual</w:t>
-      </w:r>
-    </w:p>
-    <w:p>
-      <w:pPr>
-        <w:spacing w:after="60"/>
-      </w:pPr>
-      <w:r>
-        <w:rPr>
-          <w:rFonts w:ascii="Trebuchet MS" w:cs="Trebuchet MS" w:eastAsia="Trebuchet MS" w:hAnsi="Trebuchet MS"/>
-          <w:color w:val="1F2833"/>
-          <w:sz w:val="20"/>
-          <w:szCs w:val="20"/>
-        </w:rPr>
-        <w:t xml:space="preserve">  •  During the bootcamp they are delivered and explained how to use them better than the general public</w:t>
-      </w:r>
-    </w:p>
-    <w:p>
-      <w:pPr>
-        <w:spacing w:after="60"/>
-      </w:pPr>
-      <w:r>
-        <w:rPr>
-          <w:rFonts w:ascii="Trebuchet MS" w:cs="Trebuchet MS" w:eastAsia="Trebuchet MS" w:hAnsi="Trebuchet MS"/>
-          <w:color w:val="1F2833"/>
-          <w:sz w:val="20"/>
-          <w:szCs w:val="20"/>
-        </w:rPr>
-        <w:t xml:space="preserve">  •  Base set included in the bootcamp; additional assistants available at $347 USD each</w:t>
-      </w:r>
-    </w:p>
-    <w:p>
-      <w:pPr>
-        <w:pStyle w:val="Heading3"/>
-        <w:spacing w:after="100" w:before="200"/>
-      </w:pPr>
-      <w:r>
-        <w:rPr>
-          <w:rFonts w:ascii="Arial" w:cs="Arial" w:eastAsia="Arial" w:hAnsi="Arial"/>
-          <w:b/>
-          <w:bCs/>
-          <w:color w:val="FFA000"/>
-          <w:sz w:val="22"/>
-          <w:szCs w:val="22"/>
-        </w:rPr>
-        <w:t xml:space="preserve">Prompt Libraries</w:t>
-      </w:r>
-    </w:p>
-    <w:p>
-      <w:pPr>
-        <w:spacing w:after="60"/>
-      </w:pPr>
-      <w:r>
-        <w:rPr>
-          <w:rFonts w:ascii="Trebuchet MS" w:cs="Trebuchet MS" w:eastAsia="Trebuchet MS" w:hAnsi="Trebuchet MS"/>
-          <w:color w:val="1F2833"/>
-          <w:sz w:val="20"/>
-          <w:szCs w:val="20"/>
-        </w:rPr>
-        <w:t xml:space="preserve">  •  Universal Prompt Library: collection for any professional, access from day 1</w:t>
-      </w:r>
-    </w:p>
-    <w:p>
-      <w:pPr>
-        <w:spacing w:after="60"/>
-      </w:pPr>
-      <w:r>
-        <w:rPr>
-          <w:rFonts w:ascii="Trebuchet MS" w:cs="Trebuchet MS" w:eastAsia="Trebuchet MS" w:hAnsi="Trebuchet MS"/>
-          <w:color w:val="1F2833"/>
-          <w:sz w:val="20"/>
-          <w:szCs w:val="20"/>
-        </w:rPr>
-        <w:t xml:space="preserve">  •  Executive &amp; Manager Prompt Library: specialized prompts for strategy, decision-making, delegation, executive communication, reports</w:t>
-      </w:r>
-    </w:p>
-    <w:p>
-      <w:pPr>
-        <w:pStyle w:val="Heading3"/>
-        <w:spacing w:after="100" w:before="200"/>
-      </w:pPr>
-      <w:r>
-        <w:rPr>
-          <w:rFonts w:ascii="Arial" w:cs="Arial" w:eastAsia="Arial" w:hAnsi="Arial"/>
-          <w:b/>
-          <w:bCs/>
-          <w:color w:val="FFA000"/>
-          <w:sz w:val="22"/>
-          <w:szCs w:val="22"/>
-        </w:rPr>
-        <w:t xml:space="preserve">Digital Second Brain</w:t>
-      </w:r>
-    </w:p>
-    <w:p>
-      <w:pPr>
-        <w:spacing w:after="60"/>
-      </w:pPr>
-      <w:r>
-        <w:rPr>
-          <w:rFonts w:ascii="Trebuchet MS" w:cs="Trebuchet MS" w:eastAsia="Trebuchet MS" w:hAnsi="Trebuchet MS"/>
-          <w:color w:val="1F2833"/>
-          <w:sz w:val="20"/>
-          <w:szCs w:val="20"/>
-        </w:rPr>
-        <w:t xml:space="preserve">  •  Powered by NotebookLM</w:t>
-      </w:r>
-    </w:p>
-    <w:p>
-      <w:pPr>
-        <w:spacing w:after="60"/>
-      </w:pPr>
-      <w:r>
-        <w:rPr>
-          <w:rFonts w:ascii="Trebuchet MS" w:cs="Trebuchet MS" w:eastAsia="Trebuchet MS" w:hAnsi="Trebuchet MS"/>
-          <w:color w:val="1F2833"/>
-          <w:sz w:val="20"/>
-          <w:szCs w:val="20"/>
-        </w:rPr>
-        <w:t xml:space="preserve">  •  Organizes, connects, and retrieves accumulated knowledge</w:t>
-      </w:r>
-    </w:p>
-    <w:p>
-      <w:pPr>
-        <w:spacing w:after="60"/>
-      </w:pPr>
-      <w:r>
-        <w:rPr>
-          <w:rFonts w:ascii="Trebuchet MS" w:cs="Trebuchet MS" w:eastAsia="Trebuchet MS" w:hAnsi="Trebuchet MS"/>
-          <w:color w:val="1F2833"/>
-          <w:sz w:val="20"/>
-          <w:szCs w:val="20"/>
-        </w:rPr>
-        <w:t xml:space="preserve">  •  Fed with the executive's documents, meetings, and decisions</w:t>
-      </w:r>
-    </w:p>
-    <w:p>
-      <w:pPr>
-        <w:spacing w:after="60"/>
-      </w:pPr>
-      <w:r>
-        <w:rPr>
-          <w:rFonts w:ascii="Trebuchet MS" w:cs="Trebuchet MS" w:eastAsia="Trebuchet MS" w:hAnsi="Trebuchet MS"/>
-          <w:color w:val="1F2833"/>
-          <w:sz w:val="20"/>
-          <w:szCs w:val="20"/>
-        </w:rPr>
-        <w:t xml:space="preserve">  •  Available 24/7, with no memory limits</w:t>
-      </w:r>
-    </w:p>
+        <w:t xml:space="preserve">What You Receive (no fine print)</w:t>
+      </w:r>
+    </w:p>
+    <w:tbl>
+      <w:tblPr>
+        <w:tblW w:type="dxa" w:w="9000"/>
+        <w:tblBorders>
+          <w:top w:val="single" w:color="auto" w:sz="4"/>
+          <w:left w:val="single" w:color="auto" w:sz="4"/>
+          <w:bottom w:val="single" w:color="auto" w:sz="4"/>
+          <w:right w:val="single" w:color="auto" w:sz="4"/>
+          <w:insideH w:val="single" w:color="auto" w:sz="4"/>
+          <w:insideV w:val="single" w:color="auto" w:sz="4"/>
+        </w:tblBorders>
+      </w:tblPr>
+      <w:tblGrid>
+        <w:gridCol w:w="100"/>
+        <w:gridCol w:w="100"/>
+        <w:gridCol w:w="100"/>
+      </w:tblGrid>
+      <w:tr>
+        <w:tc>
+          <w:tcPr>
+            <w:tcW w:type="dxa" w:w="3000"/>
+            <w:shd w:fill="0B2545" w:color="auto" w:val="clear"/>
+          </w:tcPr>
+          <w:p>
+            <w:pPr>
+              <w:spacing w:after="40" w:before="40"/>
+            </w:pPr>
+            <w:r>
+              <w:rPr>
+                <w:rFonts w:ascii="Arial" w:cs="Arial" w:eastAsia="Arial" w:hAnsi="Arial"/>
+                <w:b/>
+                <w:bCs/>
+                <w:color w:val="FFFFFF"/>
+                <w:sz w:val="18"/>
+                <w:szCs w:val="18"/>
+              </w:rPr>
+              <w:t xml:space="preserve">#</w:t>
+            </w:r>
+          </w:p>
+        </w:tc>
+        <w:tc>
+          <w:tcPr>
+            <w:tcW w:type="dxa" w:w="3000"/>
+            <w:shd w:fill="0B2545" w:color="auto" w:val="clear"/>
+          </w:tcPr>
+          <w:p>
+            <w:pPr>
+              <w:spacing w:after="40" w:before="40"/>
+            </w:pPr>
+            <w:r>
+              <w:rPr>
+                <w:rFonts w:ascii="Arial" w:cs="Arial" w:eastAsia="Arial" w:hAnsi="Arial"/>
+                <w:b/>
+                <w:bCs/>
+                <w:color w:val="FFFFFF"/>
+                <w:sz w:val="18"/>
+                <w:szCs w:val="18"/>
+              </w:rPr>
+              <w:t xml:space="preserve">Deliverable</w:t>
+            </w:r>
+          </w:p>
+        </w:tc>
+        <w:tc>
+          <w:tcPr>
+            <w:tcW w:type="dxa" w:w="3000"/>
+            <w:shd w:fill="0B2545" w:color="auto" w:val="clear"/>
+          </w:tcPr>
+          <w:p>
+            <w:pPr>
+              <w:spacing w:after="40" w:before="40"/>
+            </w:pPr>
+            <w:r>
+              <w:rPr>
+                <w:rFonts w:ascii="Arial" w:cs="Arial" w:eastAsia="Arial" w:hAnsi="Arial"/>
+                <w:b/>
+                <w:bCs/>
+                <w:color w:val="FFFFFF"/>
+                <w:sz w:val="18"/>
+                <w:szCs w:val="18"/>
+              </w:rPr>
+              <w:t xml:space="preserve">What it is exactly</w:t>
+            </w:r>
+          </w:p>
+        </w:tc>
+      </w:tr>
+      <w:tr>
+        <w:tc>
+          <w:tcPr>
+            <w:tcW w:type="dxa" w:w="3000"/>
+          </w:tcPr>
+          <w:p>
+            <w:pPr>
+              <w:spacing w:after="40" w:before="40"/>
+            </w:pPr>
+            <w:r>
+              <w:rPr>
+                <w:rFonts w:ascii="Trebuchet MS" w:cs="Trebuchet MS" w:eastAsia="Trebuchet MS" w:hAnsi="Trebuchet MS"/>
+                <w:b w:val="false"/>
+                <w:bCs w:val="false"/>
+                <w:color w:val="1F2833"/>
+                <w:sz w:val="18"/>
+                <w:szCs w:val="18"/>
+              </w:rPr>
+              <w:t xml:space="preserve">1</w:t>
+            </w:r>
+          </w:p>
+        </w:tc>
+        <w:tc>
+          <w:tcPr>
+            <w:tcW w:type="dxa" w:w="3000"/>
+          </w:tcPr>
+          <w:p>
+            <w:pPr>
+              <w:spacing w:after="40" w:before="40"/>
+            </w:pPr>
+            <w:r>
+              <w:rPr>
+                <w:rFonts w:ascii="Trebuchet MS" w:cs="Trebuchet MS" w:eastAsia="Trebuchet MS" w:hAnsi="Trebuchet MS"/>
+                <w:b w:val="false"/>
+                <w:bCs w:val="false"/>
+                <w:color w:val="1F2833"/>
+                <w:sz w:val="18"/>
+                <w:szCs w:val="18"/>
+              </w:rPr>
+              <w:t xml:space="preserve">1 personal agent</w:t>
+            </w:r>
+          </w:p>
+        </w:tc>
+        <w:tc>
+          <w:tcPr>
+            <w:tcW w:type="dxa" w:w="3000"/>
+          </w:tcPr>
+          <w:p>
+            <w:pPr>
+              <w:spacing w:after="40" w:before="40"/>
+            </w:pPr>
+            <w:r>
+              <w:rPr>
+                <w:rFonts w:ascii="Trebuchet MS" w:cs="Trebuchet MS" w:eastAsia="Trebuchet MS" w:hAnsi="Trebuchet MS"/>
+                <w:b w:val="false"/>
+                <w:bCs w:val="false"/>
+                <w:color w:val="1F2833"/>
+                <w:sz w:val="18"/>
+                <w:szCs w:val="18"/>
+              </w:rPr>
+              <w:t xml:space="preserve">We install Pristino, an Open Source agent developed and maintained by MetodologIA, Javier Montano's work. Yours forever, auditable, runs locally. Connected to Gmail, Calendar and Drive.</w:t>
+            </w:r>
+          </w:p>
+        </w:tc>
+      </w:tr>
+      <w:tr>
+        <w:tc>
+          <w:tcPr>
+            <w:tcW w:type="dxa" w:w="3000"/>
+            <w:shd w:fill="F8F9FC" w:color="auto" w:val="clear"/>
+          </w:tcPr>
+          <w:p>
+            <w:pPr>
+              <w:spacing w:after="40" w:before="40"/>
+            </w:pPr>
+            <w:r>
+              <w:rPr>
+                <w:rFonts w:ascii="Trebuchet MS" w:cs="Trebuchet MS" w:eastAsia="Trebuchet MS" w:hAnsi="Trebuchet MS"/>
+                <w:b w:val="false"/>
+                <w:bCs w:val="false"/>
+                <w:color w:val="1F2833"/>
+                <w:sz w:val="18"/>
+                <w:szCs w:val="18"/>
+              </w:rPr>
+              <w:t xml:space="preserve">2</w:t>
+            </w:r>
+          </w:p>
+        </w:tc>
+        <w:tc>
+          <w:tcPr>
+            <w:tcW w:type="dxa" w:w="3000"/>
+            <w:shd w:fill="F8F9FC" w:color="auto" w:val="clear"/>
+          </w:tcPr>
+          <w:p>
+            <w:pPr>
+              <w:spacing w:after="40" w:before="40"/>
+            </w:pPr>
+            <w:r>
+              <w:rPr>
+                <w:rFonts w:ascii="Trebuchet MS" w:cs="Trebuchet MS" w:eastAsia="Trebuchet MS" w:hAnsi="Trebuchet MS"/>
+                <w:b w:val="false"/>
+                <w:bCs w:val="false"/>
+                <w:color w:val="1F2833"/>
+                <w:sz w:val="18"/>
+                <w:szCs w:val="18"/>
+              </w:rPr>
+              <w:t xml:space="preserve">13 specialized AI assistants</w:t>
+            </w:r>
+          </w:p>
+        </w:tc>
+        <w:tc>
+          <w:tcPr>
+            <w:tcW w:type="dxa" w:w="3000"/>
+            <w:shd w:fill="F8F9FC" w:color="auto" w:val="clear"/>
+          </w:tcPr>
+          <w:p>
+            <w:pPr>
+              <w:spacing w:after="40" w:before="40"/>
+            </w:pPr>
+            <w:r>
+              <w:rPr>
+                <w:rFonts w:ascii="Trebuchet MS" w:cs="Trebuchet MS" w:eastAsia="Trebuchet MS" w:hAnsi="Trebuchet MS"/>
+                <w:b w:val="false"/>
+                <w:bCs w:val="false"/>
+                <w:color w:val="1F2833"/>
+                <w:sz w:val="18"/>
+                <w:szCs w:val="18"/>
+              </w:rPr>
+              <w:t xml:space="preserve">Ready to use in workflows from day 1. Each covers an executive function: communication, analysis, scheduling, decisions, reports. Specialized (by function), not personalized (by individual). During the bootcamp you learn to use them better than the public.</w:t>
+            </w:r>
+          </w:p>
+        </w:tc>
+      </w:tr>
+      <w:tr>
+        <w:tc>
+          <w:tcPr>
+            <w:tcW w:type="dxa" w:w="3000"/>
+          </w:tcPr>
+          <w:p>
+            <w:pPr>
+              <w:spacing w:after="40" w:before="40"/>
+            </w:pPr>
+            <w:r>
+              <w:rPr>
+                <w:rFonts w:ascii="Trebuchet MS" w:cs="Trebuchet MS" w:eastAsia="Trebuchet MS" w:hAnsi="Trebuchet MS"/>
+                <w:b w:val="false"/>
+                <w:bCs w:val="false"/>
+                <w:color w:val="1F2833"/>
+                <w:sz w:val="18"/>
+                <w:szCs w:val="18"/>
+              </w:rPr>
+              <w:t xml:space="preserve">3</w:t>
+            </w:r>
+          </w:p>
+        </w:tc>
+        <w:tc>
+          <w:tcPr>
+            <w:tcW w:type="dxa" w:w="3000"/>
+          </w:tcPr>
+          <w:p>
+            <w:pPr>
+              <w:spacing w:after="40" w:before="40"/>
+            </w:pPr>
+            <w:r>
+              <w:rPr>
+                <w:rFonts w:ascii="Trebuchet MS" w:cs="Trebuchet MS" w:eastAsia="Trebuchet MS" w:hAnsi="Trebuchet MS"/>
+                <w:b w:val="false"/>
+                <w:bCs w:val="false"/>
+                <w:color w:val="1F2833"/>
+                <w:sz w:val="18"/>
+                <w:szCs w:val="18"/>
+              </w:rPr>
+              <w:t xml:space="preserve">1 Introduction Playbook</w:t>
+            </w:r>
+          </w:p>
+        </w:tc>
+        <w:tc>
+          <w:tcPr>
+            <w:tcW w:type="dxa" w:w="3000"/>
+          </w:tcPr>
+          <w:p>
+            <w:pPr>
+              <w:spacing w:after="40" w:before="40"/>
+            </w:pPr>
+            <w:r>
+              <w:rPr>
+                <w:rFonts w:ascii="Trebuchet MS" w:cs="Trebuchet MS" w:eastAsia="Trebuchet MS" w:hAnsi="Trebuchet MS"/>
+                <w:b w:val="false"/>
+                <w:bCs w:val="false"/>
+                <w:color w:val="1F2833"/>
+                <w:sz w:val="18"/>
+                <w:szCs w:val="18"/>
+              </w:rPr>
+              <w:t xml:space="preserve">"How to Lead in the AI Era". Practical guide for executives who want to lead with AI without depending on technicians.</w:t>
+            </w:r>
+          </w:p>
+        </w:tc>
+      </w:tr>
+      <w:tr>
+        <w:tc>
+          <w:tcPr>
+            <w:tcW w:type="dxa" w:w="3000"/>
+            <w:shd w:fill="F8F9FC" w:color="auto" w:val="clear"/>
+          </w:tcPr>
+          <w:p>
+            <w:pPr>
+              <w:spacing w:after="40" w:before="40"/>
+            </w:pPr>
+            <w:r>
+              <w:rPr>
+                <w:rFonts w:ascii="Trebuchet MS" w:cs="Trebuchet MS" w:eastAsia="Trebuchet MS" w:hAnsi="Trebuchet MS"/>
+                <w:b w:val="false"/>
+                <w:bCs w:val="false"/>
+                <w:color w:val="1F2833"/>
+                <w:sz w:val="18"/>
+                <w:szCs w:val="18"/>
+              </w:rPr>
+              <w:t xml:space="preserve">4</w:t>
+            </w:r>
+          </w:p>
+        </w:tc>
+        <w:tc>
+          <w:tcPr>
+            <w:tcW w:type="dxa" w:w="3000"/>
+            <w:shd w:fill="F8F9FC" w:color="auto" w:val="clear"/>
+          </w:tcPr>
+          <w:p>
+            <w:pPr>
+              <w:spacing w:after="40" w:before="40"/>
+            </w:pPr>
+            <w:r>
+              <w:rPr>
+                <w:rFonts w:ascii="Trebuchet MS" w:cs="Trebuchet MS" w:eastAsia="Trebuchet MS" w:hAnsi="Trebuchet MS"/>
+                <w:b w:val="false"/>
+                <w:bCs w:val="false"/>
+                <w:color w:val="1F2833"/>
+                <w:sz w:val="18"/>
+                <w:szCs w:val="18"/>
+              </w:rPr>
+              <w:t xml:space="preserve">2 prompt libraries</w:t>
+            </w:r>
+          </w:p>
+        </w:tc>
+        <w:tc>
+          <w:tcPr>
+            <w:tcW w:type="dxa" w:w="3000"/>
+            <w:shd w:fill="F8F9FC" w:color="auto" w:val="clear"/>
+          </w:tcPr>
+          <w:p>
+            <w:pPr>
+              <w:spacing w:after="40" w:before="40"/>
+            </w:pPr>
+            <w:r>
+              <w:rPr>
+                <w:rFonts w:ascii="Trebuchet MS" w:cs="Trebuchet MS" w:eastAsia="Trebuchet MS" w:hAnsi="Trebuchet MS"/>
+                <w:b w:val="false"/>
+                <w:bCs w:val="false"/>
+                <w:color w:val="1F2833"/>
+                <w:sz w:val="18"/>
+                <w:szCs w:val="18"/>
+              </w:rPr>
+              <w:t xml:space="preserve">Universal Library (for any professional, from day 1) + Executive Library (strategy, decision-making, delegation, executive communication, reports).</w:t>
+            </w:r>
+          </w:p>
+        </w:tc>
+      </w:tr>
+      <w:tr>
+        <w:tc>
+          <w:tcPr>
+            <w:tcW w:type="dxa" w:w="3000"/>
+          </w:tcPr>
+          <w:p>
+            <w:pPr>
+              <w:spacing w:after="40" w:before="40"/>
+            </w:pPr>
+            <w:r>
+              <w:rPr>
+                <w:rFonts w:ascii="Trebuchet MS" w:cs="Trebuchet MS" w:eastAsia="Trebuchet MS" w:hAnsi="Trebuchet MS"/>
+                <w:b w:val="false"/>
+                <w:bCs w:val="false"/>
+                <w:color w:val="1F2833"/>
+                <w:sz w:val="18"/>
+                <w:szCs w:val="18"/>
+              </w:rPr>
+              <w:t xml:space="preserve">5</w:t>
+            </w:r>
+          </w:p>
+        </w:tc>
+        <w:tc>
+          <w:tcPr>
+            <w:tcW w:type="dxa" w:w="3000"/>
+          </w:tcPr>
+          <w:p>
+            <w:pPr>
+              <w:spacing w:after="40" w:before="40"/>
+            </w:pPr>
+            <w:r>
+              <w:rPr>
+                <w:rFonts w:ascii="Trebuchet MS" w:cs="Trebuchet MS" w:eastAsia="Trebuchet MS" w:hAnsi="Trebuchet MS"/>
+                <w:b w:val="false"/>
+                <w:bCs w:val="false"/>
+                <w:color w:val="1F2833"/>
+                <w:sz w:val="18"/>
+                <w:szCs w:val="18"/>
+              </w:rPr>
+              <w:t xml:space="preserve">1 digital second brain</w:t>
+            </w:r>
+          </w:p>
+        </w:tc>
+        <w:tc>
+          <w:tcPr>
+            <w:tcW w:type="dxa" w:w="3000"/>
+          </w:tcPr>
+          <w:p>
+            <w:pPr>
+              <w:spacing w:after="40" w:before="40"/>
+            </w:pPr>
+            <w:r>
+              <w:rPr>
+                <w:rFonts w:ascii="Trebuchet MS" w:cs="Trebuchet MS" w:eastAsia="Trebuchet MS" w:hAnsi="Trebuchet MS"/>
+                <w:b w:val="false"/>
+                <w:bCs w:val="false"/>
+                <w:color w:val="1F2833"/>
+                <w:sz w:val="18"/>
+                <w:szCs w:val="18"/>
+              </w:rPr>
+              <w:t xml:space="preserve">We install NotebookLM as your external memory: organizes documents, connects ideas, retrieves knowledge. Available 24/7.</w:t>
+            </w:r>
+          </w:p>
+        </w:tc>
+      </w:tr>
+      <w:tr>
+        <w:tc>
+          <w:tcPr>
+            <w:tcW w:type="dxa" w:w="3000"/>
+            <w:shd w:fill="F8F9FC" w:color="auto" w:val="clear"/>
+          </w:tcPr>
+          <w:p>
+            <w:pPr>
+              <w:spacing w:after="40" w:before="40"/>
+            </w:pPr>
+            <w:r>
+              <w:rPr>
+                <w:rFonts w:ascii="Trebuchet MS" w:cs="Trebuchet MS" w:eastAsia="Trebuchet MS" w:hAnsi="Trebuchet MS"/>
+                <w:b w:val="false"/>
+                <w:bCs w:val="false"/>
+                <w:color w:val="1F2833"/>
+                <w:sz w:val="18"/>
+                <w:szCs w:val="18"/>
+              </w:rPr>
+              <w:t xml:space="preserve">6</w:t>
+            </w:r>
+          </w:p>
+        </w:tc>
+        <w:tc>
+          <w:tcPr>
+            <w:tcW w:type="dxa" w:w="3000"/>
+            <w:shd w:fill="F8F9FC" w:color="auto" w:val="clear"/>
+          </w:tcPr>
+          <w:p>
+            <w:pPr>
+              <w:spacing w:after="40" w:before="40"/>
+            </w:pPr>
+            <w:r>
+              <w:rPr>
+                <w:rFonts w:ascii="Trebuchet MS" w:cs="Trebuchet MS" w:eastAsia="Trebuchet MS" w:hAnsi="Trebuchet MS"/>
+                <w:b w:val="false"/>
+                <w:bCs w:val="false"/>
+                <w:color w:val="1F2833"/>
+                <w:sz w:val="18"/>
+                <w:szCs w:val="18"/>
+              </w:rPr>
+              <w:t xml:space="preserve">9 co-creation sessions</w:t>
+            </w:r>
+          </w:p>
+        </w:tc>
+        <w:tc>
+          <w:tcPr>
+            <w:tcW w:type="dxa" w:w="3000"/>
+            <w:shd w:fill="F8F9FC" w:color="auto" w:val="clear"/>
+          </w:tcPr>
+          <w:p>
+            <w:pPr>
+              <w:spacing w:after="40" w:before="40"/>
+            </w:pPr>
+            <w:r>
+              <w:rPr>
+                <w:rFonts w:ascii="Trebuchet MS" w:cs="Trebuchet MS" w:eastAsia="Trebuchet MS" w:hAnsi="Trebuchet MS"/>
+                <w:b w:val="false"/>
+                <w:bCs w:val="false"/>
+                <w:color w:val="1F2833"/>
+                <w:sz w:val="18"/>
+                <w:szCs w:val="18"/>
+              </w:rPr>
+              <w:t xml:space="preserve">2 hours each with facilitator. Not a lecture: we build together, with your real work context.</w:t>
+            </w:r>
+          </w:p>
+        </w:tc>
+      </w:tr>
+      <w:tr>
+        <w:tc>
+          <w:tcPr>
+            <w:tcW w:type="dxa" w:w="3000"/>
+          </w:tcPr>
+          <w:p>
+            <w:pPr>
+              <w:spacing w:after="40" w:before="40"/>
+            </w:pPr>
+            <w:r>
+              <w:rPr>
+                <w:rFonts w:ascii="Trebuchet MS" w:cs="Trebuchet MS" w:eastAsia="Trebuchet MS" w:hAnsi="Trebuchet MS"/>
+                <w:b w:val="false"/>
+                <w:bCs w:val="false"/>
+                <w:color w:val="1F2833"/>
+                <w:sz w:val="18"/>
+                <w:szCs w:val="18"/>
+              </w:rPr>
+              <w:t xml:space="preserve">7</w:t>
+            </w:r>
+          </w:p>
+        </w:tc>
+        <w:tc>
+          <w:tcPr>
+            <w:tcW w:type="dxa" w:w="3000"/>
+          </w:tcPr>
+          <w:p>
+            <w:pPr>
+              <w:spacing w:after="40" w:before="40"/>
+            </w:pPr>
+            <w:r>
+              <w:rPr>
+                <w:rFonts w:ascii="Trebuchet MS" w:cs="Trebuchet MS" w:eastAsia="Trebuchet MS" w:hAnsi="Trebuchet MS"/>
+                <w:b w:val="false"/>
+                <w:bCs w:val="false"/>
+                <w:color w:val="1F2833"/>
+                <w:sz w:val="18"/>
+                <w:szCs w:val="18"/>
+              </w:rPr>
+              <w:t xml:space="preserve">1 Virtual Campus access</w:t>
+            </w:r>
+          </w:p>
+        </w:tc>
+        <w:tc>
+          <w:tcPr>
+            <w:tcW w:type="dxa" w:w="3000"/>
+          </w:tcPr>
+          <w:p>
+            <w:pPr>
+              <w:spacing w:after="40" w:before="40"/>
+            </w:pPr>
+            <w:r>
+              <w:rPr>
+                <w:rFonts w:ascii="Trebuchet MS" w:cs="Trebuchet MS" w:eastAsia="Trebuchet MS" w:hAnsi="Trebuchet MS"/>
+                <w:b w:val="false"/>
+                <w:bCs w:val="false"/>
+                <w:color w:val="1F2833"/>
+                <w:sz w:val="18"/>
+                <w:szCs w:val="18"/>
+              </w:rPr>
+              <w:t xml:space="preserve">MetodologIA platform with resources, updates and community. 1 month included, optional renewal.</w:t>
+            </w:r>
+          </w:p>
+        </w:tc>
+      </w:tr>
+    </w:tbl>
     <w:p>
       <w:pPr>
         <w:pStyle w:val="Heading3"/>

</xml_diff>

<commit_message>
content: masterclass lunes Pascua + sesiones comunidad + estructura 25h
Empezamos lunes de Pascua (6 abril, 7PM):
- Masterclass opcional "IA: que esta pasando y como sacarle provecho" (2h)
- Martes 7 abril 7PM: Taller "De Ocupado a Productivo" (3h)
- Sabado opcional: 9-12 o 14-17
- CAO Bootcamp: hasta 20h para quienes continuen
- Total: hasta 25h (2 + 3 + 20)

Nuevo deliverable: Sesiones de comunidad
- 1 domingo/mes: workshops de actualizacion
- 1 sabado/mes: clinicas de IA en vivo (resolver enredos del dia a dia)

Countdowns en 4 HTMLs apuntan a lunes 6 abril 19:00 ECT.
Actualizado en content.json, 4 MDs, 4 HTMLs, 4 DOCX.

Co-Authored-By: Claude Opus 4.6 (1M context) <noreply@anthropic.com>
</commit_message>
<xml_diff>
--- a/propuesta-bootcamp-ejecutivo-quito-2026/outputs/v2/export/propuesta-detallada-en.docx
+++ b/propuesta-bootcamp-ejecutivo-quito-2026/outputs/v2/export/propuesta-detallada-en.docx
@@ -1009,6 +1009,139 @@
           </w:p>
         </w:tc>
       </w:tr>
+      <w:tr>
+        <w:tc>
+          <w:tcPr>
+            <w:tcW w:type="dxa" w:w="3000"/>
+            <w:shd w:fill="F8F9FC" w:color="auto" w:val="clear"/>
+          </w:tcPr>
+          <w:p>
+            <w:pPr>
+              <w:spacing w:after="40" w:before="40"/>
+            </w:pPr>
+            <w:r>
+              <w:rPr>
+                <w:rFonts w:ascii="Trebuchet MS" w:cs="Trebuchet MS" w:eastAsia="Trebuchet MS" w:hAnsi="Trebuchet MS"/>
+                <w:b w:val="false"/>
+                <w:bCs w:val="false"/>
+                <w:color w:val="1F2833"/>
+                <w:sz w:val="18"/>
+                <w:szCs w:val="18"/>
+              </w:rPr>
+              <w:t xml:space="preserve">8</w:t>
+            </w:r>
+          </w:p>
+        </w:tc>
+        <w:tc>
+          <w:tcPr>
+            <w:tcW w:type="dxa" w:w="3000"/>
+            <w:shd w:fill="F8F9FC" w:color="auto" w:val="clear"/>
+          </w:tcPr>
+          <w:p>
+            <w:pPr>
+              <w:spacing w:after="40" w:before="40"/>
+            </w:pPr>
+            <w:r>
+              <w:rPr>
+                <w:rFonts w:ascii="Trebuchet MS" w:cs="Trebuchet MS" w:eastAsia="Trebuchet MS" w:hAnsi="Trebuchet MS"/>
+                <w:b w:val="false"/>
+                <w:bCs w:val="false"/>
+                <w:color w:val="1F2833"/>
+                <w:sz w:val="18"/>
+                <w:szCs w:val="18"/>
+              </w:rPr>
+              <w:t xml:space="preserve">Community sessions</w:t>
+            </w:r>
+          </w:p>
+        </w:tc>
+        <w:tc>
+          <w:tcPr>
+            <w:tcW w:type="dxa" w:w="3000"/>
+            <w:shd w:fill="F8F9FC" w:color="auto" w:val="clear"/>
+          </w:tcPr>
+          <w:p>
+            <w:pPr>
+              <w:spacing w:after="40" w:before="40"/>
+            </w:pPr>
+            <w:r>
+              <w:rPr>
+                <w:rFonts w:ascii="Trebuchet MS" w:cs="Trebuchet MS" w:eastAsia="Trebuchet MS" w:hAnsi="Trebuchet MS"/>
+                <w:b w:val="false"/>
+                <w:bCs w:val="false"/>
+                <w:color w:val="1F2833"/>
+                <w:sz w:val="18"/>
+                <w:szCs w:val="18"/>
+              </w:rPr>
+              <w:t xml:space="preserve">1 Sunday/month: update workshops. 1 Saturday/month: live AI clinics to solve day-to-day tangles.</w:t>
+            </w:r>
+          </w:p>
+        </w:tc>
+      </w:tr>
+      <w:tr>
+        <w:tc>
+          <w:tcPr>
+            <w:tcW w:type="dxa" w:w="3000"/>
+          </w:tcPr>
+          <w:p>
+            <w:pPr>
+              <w:spacing w:after="40" w:before="40"/>
+            </w:pPr>
+            <w:r>
+              <w:rPr>
+                <w:rFonts w:ascii="Trebuchet MS" w:cs="Trebuchet MS" w:eastAsia="Trebuchet MS" w:hAnsi="Trebuchet MS"/>
+                <w:b w:val="false"/>
+                <w:bCs w:val="false"/>
+                <w:color w:val="1F2833"/>
+                <w:sz w:val="18"/>
+                <w:szCs w:val="18"/>
+              </w:rPr>
+              <w:t xml:space="preserve">9</w:t>
+            </w:r>
+          </w:p>
+        </w:tc>
+        <w:tc>
+          <w:tcPr>
+            <w:tcW w:type="dxa" w:w="3000"/>
+          </w:tcPr>
+          <w:p>
+            <w:pPr>
+              <w:spacing w:after="40" w:before="40"/>
+            </w:pPr>
+            <w:r>
+              <w:rPr>
+                <w:rFonts w:ascii="Trebuchet MS" w:cs="Trebuchet MS" w:eastAsia="Trebuchet MS" w:hAnsi="Trebuchet MS"/>
+                <w:b w:val="false"/>
+                <w:bCs w:val="false"/>
+                <w:color w:val="1F2833"/>
+                <w:sz w:val="18"/>
+                <w:szCs w:val="18"/>
+              </w:rPr>
+              <w:t xml:space="preserve">Optional Masterclass</w:t>
+            </w:r>
+          </w:p>
+        </w:tc>
+        <w:tc>
+          <w:tcPr>
+            <w:tcW w:type="dxa" w:w="3000"/>
+          </w:tcPr>
+          <w:p>
+            <w:pPr>
+              <w:spacing w:after="40" w:before="40"/>
+            </w:pPr>
+            <w:r>
+              <w:rPr>
+                <w:rFonts w:ascii="Trebuchet MS" w:cs="Trebuchet MS" w:eastAsia="Trebuchet MS" w:hAnsi="Trebuchet MS"/>
+                <w:b w:val="false"/>
+                <w:bCs w:val="false"/>
+                <w:color w:val="1F2833"/>
+                <w:sz w:val="18"/>
+                <w:szCs w:val="18"/>
+              </w:rPr>
+              <w:t xml:space="preserve">"AI: what is happening and how to take advantage". Easter Monday (April 6), 7PM. 2 hours. Current landscape for executives.</w:t>
+            </w:r>
+          </w:p>
+        </w:tc>
+      </w:tr>
     </w:tbl>
     <w:p>
       <w:pPr>
@@ -1134,6 +1267,34 @@
           <w:szCs w:val="22"/>
         </w:rPr>
         <w:t xml:space="preserve">4 Levels of Depth</w:t>
+      </w:r>
+    </w:p>
+    <w:p>
+      <w:pPr>
+        <w:spacing w:after="80"/>
+      </w:pPr>
+      <w:r>
+        <w:rPr>
+          <w:rFonts w:ascii="Trebuchet MS" w:cs="Trebuchet MS" w:eastAsia="Trebuchet MS" w:hAnsi="Trebuchet MS"/>
+          <w:color w:val="1F2833"/>
+          <w:sz w:val="20"/>
+          <w:szCs w:val="20"/>
+        </w:rPr>
+        <w:t xml:space="preserve">Hour structure: up to 25h total</w:t>
+      </w:r>
+    </w:p>
+    <w:p>
+      <w:pPr>
+        <w:spacing w:after="60"/>
+      </w:pPr>
+      <w:r>
+        <w:rPr>
+          <w:rFonts w:ascii="Trebuchet MS" w:cs="Trebuchet MS" w:eastAsia="Trebuchet MS" w:hAnsi="Trebuchet MS"/>
+          <w:color w:val="1F2833"/>
+          <w:sz w:val="20"/>
+          <w:szCs w:val="20"/>
+        </w:rPr>
+        <w:t xml:space="preserve">  •  2h Masterclass (optional) + 3h Workshop (free experience) + 20h CAO Bootcamp (for those who continue)</w:t>
       </w:r>
     </w:p>
     <w:tbl>
@@ -1308,7 +1469,7 @@
                 <w:sz w:val="18"/>
                 <w:szCs w:val="18"/>
               </w:rPr>
-              <w:t xml:space="preserve">0</w:t>
+              <w:t xml:space="preserve">—</w:t>
             </w:r>
           </w:p>
         </w:tc>
@@ -1329,7 +1490,7 @@
                 <w:sz w:val="18"/>
                 <w:szCs w:val="18"/>
               </w:rPr>
-              <w:t xml:space="preserve">Workshop "From Busy to Productive"</w:t>
+              <w:t xml:space="preserve">Masterclass "AI: what is happening and how to take advantage"</w:t>
             </w:r>
           </w:p>
         </w:tc>
@@ -1371,7 +1532,7 @@
                 <w:sz w:val="18"/>
                 <w:szCs w:val="18"/>
               </w:rPr>
-              <w:t xml:space="preserve">3 hours</w:t>
+              <w:t xml:space="preserve">2 hours</w:t>
             </w:r>
           </w:p>
         </w:tc>
@@ -1392,7 +1553,7 @@
                 <w:sz w:val="18"/>
                 <w:szCs w:val="18"/>
               </w:rPr>
-              <w:t xml:space="preserve">Group (up to 13)</w:t>
+              <w:t xml:space="preserve">Open</w:t>
             </w:r>
           </w:p>
         </w:tc>
@@ -1437,7 +1598,7 @@
                 <w:sz w:val="18"/>
                 <w:szCs w:val="18"/>
               </w:rPr>
-              <w:t xml:space="preserve">2</w:t>
+              <w:t xml:space="preserve">0</w:t>
             </w:r>
           </w:p>
         </w:tc>
@@ -1459,7 +1620,7 @@
                 <w:sz w:val="18"/>
                 <w:szCs w:val="18"/>
               </w:rPr>
-              <w:t xml:space="preserve">CAO Bootcamp - Believers Edition</w:t>
+              <w:t xml:space="preserve">Workshop "From Busy to Productive"</w:t>
             </w:r>
           </w:p>
         </w:tc>
@@ -1481,7 +1642,7 @@
                 <w:sz w:val="18"/>
                 <w:szCs w:val="18"/>
               </w:rPr>
-              <w:t xml:space="preserve">$1,490 USD</w:t>
+              <w:t xml:space="preserve">Free</w:t>
             </w:r>
           </w:p>
         </w:tc>
@@ -1503,7 +1664,7 @@
                 <w:sz w:val="18"/>
                 <w:szCs w:val="18"/>
               </w:rPr>
-              <w:t xml:space="preserve">20h over 4-10 wks</w:t>
+              <w:t xml:space="preserve">3 hours</w:t>
             </w:r>
           </w:p>
         </w:tc>
@@ -1525,7 +1686,7 @@
                 <w:sz w:val="18"/>
                 <w:szCs w:val="18"/>
               </w:rPr>
-              <w:t xml:space="preserve">Solo/Duo/Trio</w:t>
+              <w:t xml:space="preserve">Group (up to 13)</w:t>
             </w:r>
           </w:p>
         </w:tc>
@@ -1547,7 +1708,7 @@
                 <w:sz w:val="18"/>
                 <w:szCs w:val="18"/>
               </w:rPr>
-              <w:t xml:space="preserve">C-level executives (5 of 13)</w:t>
+              <w:t xml:space="preserve">Executives + managers</w:t>
             </w:r>
           </w:p>
         </w:tc>
@@ -1570,7 +1731,7 @@
                 <w:sz w:val="18"/>
                 <w:szCs w:val="18"/>
               </w:rPr>
-              <w:t xml:space="preserve">2b</w:t>
+              <w:t xml:space="preserve">2</w:t>
             </w:r>
           </w:p>
         </w:tc>
@@ -1591,7 +1752,7 @@
                 <w:sz w:val="18"/>
                 <w:szCs w:val="18"/>
               </w:rPr>
-              <w:t xml:space="preserve">CAO Bootcamp - Academic Calendar</w:t>
+              <w:t xml:space="preserve">CAO Bootcamp - Believers Edition</w:t>
             </w:r>
           </w:p>
         </w:tc>
@@ -1612,7 +1773,7 @@
                 <w:sz w:val="18"/>
                 <w:szCs w:val="18"/>
               </w:rPr>
-              <w:t xml:space="preserve">$1,990 USD</w:t>
+              <w:t xml:space="preserve">$1,490 USD</w:t>
             </w:r>
           </w:p>
         </w:tc>
@@ -1675,7 +1836,7 @@
                 <w:sz w:val="18"/>
                 <w:szCs w:val="18"/>
               </w:rPr>
-              <w:t xml:space="preserve">C-level executives</w:t>
+              <w:t xml:space="preserve">C-level executives (5 of 13)</w:t>
             </w:r>
           </w:p>
         </w:tc>
@@ -1699,6 +1860,139 @@
                 <w:sz w:val="18"/>
                 <w:szCs w:val="18"/>
               </w:rPr>
+              <w:t xml:space="preserve">2b</w:t>
+            </w:r>
+          </w:p>
+        </w:tc>
+        <w:tc>
+          <w:tcPr>
+            <w:tcW w:type="dxa" w:w="1500"/>
+            <w:shd w:fill="F8F9FC" w:color="auto" w:val="clear"/>
+          </w:tcPr>
+          <w:p>
+            <w:pPr>
+              <w:spacing w:after="40" w:before="40"/>
+            </w:pPr>
+            <w:r>
+              <w:rPr>
+                <w:rFonts w:ascii="Trebuchet MS" w:cs="Trebuchet MS" w:eastAsia="Trebuchet MS" w:hAnsi="Trebuchet MS"/>
+                <w:b w:val="false"/>
+                <w:bCs w:val="false"/>
+                <w:color w:val="1F2833"/>
+                <w:sz w:val="18"/>
+                <w:szCs w:val="18"/>
+              </w:rPr>
+              <w:t xml:space="preserve">CAO Bootcamp - Academic Calendar</w:t>
+            </w:r>
+          </w:p>
+        </w:tc>
+        <w:tc>
+          <w:tcPr>
+            <w:tcW w:type="dxa" w:w="1500"/>
+            <w:shd w:fill="F8F9FC" w:color="auto" w:val="clear"/>
+          </w:tcPr>
+          <w:p>
+            <w:pPr>
+              <w:spacing w:after="40" w:before="40"/>
+            </w:pPr>
+            <w:r>
+              <w:rPr>
+                <w:rFonts w:ascii="Trebuchet MS" w:cs="Trebuchet MS" w:eastAsia="Trebuchet MS" w:hAnsi="Trebuchet MS"/>
+                <w:b w:val="false"/>
+                <w:bCs w:val="false"/>
+                <w:color w:val="1F2833"/>
+                <w:sz w:val="18"/>
+                <w:szCs w:val="18"/>
+              </w:rPr>
+              <w:t xml:space="preserve">$1,990 USD</w:t>
+            </w:r>
+          </w:p>
+        </w:tc>
+        <w:tc>
+          <w:tcPr>
+            <w:tcW w:type="dxa" w:w="1500"/>
+            <w:shd w:fill="F8F9FC" w:color="auto" w:val="clear"/>
+          </w:tcPr>
+          <w:p>
+            <w:pPr>
+              <w:spacing w:after="40" w:before="40"/>
+            </w:pPr>
+            <w:r>
+              <w:rPr>
+                <w:rFonts w:ascii="Trebuchet MS" w:cs="Trebuchet MS" w:eastAsia="Trebuchet MS" w:hAnsi="Trebuchet MS"/>
+                <w:b w:val="false"/>
+                <w:bCs w:val="false"/>
+                <w:color w:val="1F2833"/>
+                <w:sz w:val="18"/>
+                <w:szCs w:val="18"/>
+              </w:rPr>
+              <w:t xml:space="preserve">20h over 4-10 wks</w:t>
+            </w:r>
+          </w:p>
+        </w:tc>
+        <w:tc>
+          <w:tcPr>
+            <w:tcW w:type="dxa" w:w="1500"/>
+            <w:shd w:fill="F8F9FC" w:color="auto" w:val="clear"/>
+          </w:tcPr>
+          <w:p>
+            <w:pPr>
+              <w:spacing w:after="40" w:before="40"/>
+            </w:pPr>
+            <w:r>
+              <w:rPr>
+                <w:rFonts w:ascii="Trebuchet MS" w:cs="Trebuchet MS" w:eastAsia="Trebuchet MS" w:hAnsi="Trebuchet MS"/>
+                <w:b w:val="false"/>
+                <w:bCs w:val="false"/>
+                <w:color w:val="1F2833"/>
+                <w:sz w:val="18"/>
+                <w:szCs w:val="18"/>
+              </w:rPr>
+              <w:t xml:space="preserve">Solo/Duo/Trio</w:t>
+            </w:r>
+          </w:p>
+        </w:tc>
+        <w:tc>
+          <w:tcPr>
+            <w:tcW w:type="dxa" w:w="1500"/>
+            <w:shd w:fill="F8F9FC" w:color="auto" w:val="clear"/>
+          </w:tcPr>
+          <w:p>
+            <w:pPr>
+              <w:spacing w:after="40" w:before="40"/>
+            </w:pPr>
+            <w:r>
+              <w:rPr>
+                <w:rFonts w:ascii="Trebuchet MS" w:cs="Trebuchet MS" w:eastAsia="Trebuchet MS" w:hAnsi="Trebuchet MS"/>
+                <w:b w:val="false"/>
+                <w:bCs w:val="false"/>
+                <w:color w:val="1F2833"/>
+                <w:sz w:val="18"/>
+                <w:szCs w:val="18"/>
+              </w:rPr>
+              <w:t xml:space="preserve">C-level executives</w:t>
+            </w:r>
+          </w:p>
+        </w:tc>
+      </w:tr>
+      <w:tr>
+        <w:tc>
+          <w:tcPr>
+            <w:tcW w:type="dxa" w:w="1500"/>
+          </w:tcPr>
+          <w:p>
+            <w:pPr>
+              <w:spacing w:after="40" w:before="40"/>
+            </w:pPr>
+            <w:r>
+              <w:rPr>
+                <w:rFonts w:ascii="Trebuchet MS" w:cs="Trebuchet MS" w:eastAsia="Trebuchet MS" w:hAnsi="Trebuchet MS"/>
+                <w:b w:val="false"/>
+                <w:bCs w:val="false"/>
+                <w:color w:val="1F2833"/>
+                <w:sz w:val="18"/>
+                <w:szCs w:val="18"/>
+              </w:rPr>
               <w:t xml:space="preserve">3</w:t>
             </w:r>
           </w:p>
@@ -1706,7 +2000,6 @@
         <w:tc>
           <w:tcPr>
             <w:tcW w:type="dxa" w:w="1500"/>
-            <w:shd w:fill="F8F9FC" w:color="auto" w:val="clear"/>
           </w:tcPr>
           <w:p>
             <w:pPr>
@@ -1728,7 +2021,6 @@
         <w:tc>
           <w:tcPr>
             <w:tcW w:type="dxa" w:w="1500"/>
-            <w:shd w:fill="F8F9FC" w:color="auto" w:val="clear"/>
           </w:tcPr>
           <w:p>
             <w:pPr>
@@ -1750,7 +2042,6 @@
         <w:tc>
           <w:tcPr>
             <w:tcW w:type="dxa" w:w="1500"/>
-            <w:shd w:fill="F8F9FC" w:color="auto" w:val="clear"/>
           </w:tcPr>
           <w:p>
             <w:pPr>
@@ -1772,7 +2063,6 @@
         <w:tc>
           <w:tcPr>
             <w:tcW w:type="dxa" w:w="1500"/>
-            <w:shd w:fill="F8F9FC" w:color="auto" w:val="clear"/>
           </w:tcPr>
           <w:p>
             <w:pPr>
@@ -1794,7 +2084,6 @@
         <w:tc>
           <w:tcPr>
             <w:tcW w:type="dxa" w:w="1500"/>
-            <w:shd w:fill="F8F9FC" w:color="auto" w:val="clear"/>
           </w:tcPr>
           <w:p>
             <w:pPr>
@@ -1829,6 +2118,65 @@
           <w:sz w:val="22"/>
           <w:szCs w:val="22"/>
         </w:rPr>
+        <w:t xml:space="preserve">Masterclass — "AI: what is happening and how to take advantage" (Optional, Free)</w:t>
+      </w:r>
+    </w:p>
+    <w:p>
+      <w:pPr>
+        <w:spacing w:after="80"/>
+      </w:pPr>
+      <w:r>
+        <w:rPr>
+          <w:rFonts w:ascii="Trebuchet MS" w:cs="Trebuchet MS" w:eastAsia="Trebuchet MS" w:hAnsi="Trebuchet MS"/>
+          <w:color w:val="1F2833"/>
+          <w:sz w:val="20"/>
+          <w:szCs w:val="20"/>
+        </w:rPr>
+        <w:t xml:space="preserve">Date: Easter Monday, April 6, 7:00 PM</w:t>
+      </w:r>
+    </w:p>
+    <w:p>
+      <w:pPr>
+        <w:spacing w:after="80"/>
+      </w:pPr>
+      <w:r>
+        <w:rPr>
+          <w:rFonts w:ascii="Trebuchet MS" w:cs="Trebuchet MS" w:eastAsia="Trebuchet MS" w:hAnsi="Trebuchet MS"/>
+          <w:color w:val="1F2833"/>
+          <w:sz w:val="20"/>
+          <w:szCs w:val="20"/>
+        </w:rPr>
+        <w:t xml:space="preserve">Format: 2 hours, open access</w:t>
+      </w:r>
+    </w:p>
+    <w:p>
+      <w:pPr>
+        <w:spacing w:after="80"/>
+      </w:pPr>
+      <w:r>
+        <w:rPr>
+          <w:rFonts w:ascii="Trebuchet MS" w:cs="Trebuchet MS" w:eastAsia="Trebuchet MS" w:hAnsi="Trebuchet MS"/>
+          <w:color w:val="1F2833"/>
+          <w:sz w:val="20"/>
+          <w:szCs w:val="20"/>
+        </w:rPr>
+        <w:t xml:space="preserve">Purpose: Current AI landscape and how an executive can take advantage without depending on technicians. Optional — not a requirement for the Workshop or CAO.</w:t>
+      </w:r>
+    </w:p>
+    <w:p>
+      <w:pPr>
+        <w:pStyle w:val="Heading3"/>
+        <w:spacing w:after="100" w:before="200"/>
+      </w:pPr>
+      <w:r>
+        <w:rPr>
+          <w:rFonts w:ascii="Arial" w:cs="Arial" w:eastAsia="Arial" w:hAnsi="Arial"/>
+          <w:b/>
+          <w:bCs/>
+          <w:color w:val="FFA000"/>
+          <w:sz w:val="22"/>
+          <w:szCs w:val="22"/>
+        </w:rPr>
         <w:t xml:space="preserve">Level 0 — Workshop "From Busy to Productive" (Free)</w:t>
       </w:r>
     </w:p>
@@ -1843,7 +2191,7 @@
           <w:sz w:val="20"/>
           <w:szCs w:val="20"/>
         </w:rPr>
-        <w:t xml:space="preserve">Date: Tuesday April 7, 7:00 PM, April 7, 2026</w:t>
+        <w:t xml:space="preserve">Date: Tuesday April 7, 7:00 PM</w:t>
       </w:r>
     </w:p>
     <w:p>
@@ -1857,7 +2205,7 @@
           <w:sz w:val="20"/>
           <w:szCs w:val="20"/>
         </w:rPr>
-        <w:t xml:space="preserve">Format: 3 hours, group of up to 13 people</w:t>
+        <w:t xml:space="preserve">Format: 3 hours, group of up to 13 people. Also available Saturday: 9AM-12PM or 2PM-5PM</w:t>
       </w:r>
     </w:p>
     <w:p>

</xml_diff>